<commit_message>
Remove Guesty and Hostaway integrations (competitors)
</commit_message>
<xml_diff>
--- a/docs/CleanCal_Platform_Specification.docx
+++ b/docs/CleanCal_Platform_Specification.docx
@@ -444,7 +444,7 @@
         <w:t xml:space="preserve">All Major Integrations: </w:t>
       </w:r>
       <w:r>
-        <w:t xml:space="preserve">Airbnb, Vrbo, Booking.com, Guesty, Hostaway from day 1</w:t>
+        <w:t>Airbnb, Vrbo, Booking.com from day 1</w:t>
       </w:r>
     </w:p>
     <w:p>
@@ -1433,44 +1433,6 @@
       </w:r>
       <w:r>
         <w:t xml:space="preserve">Reservation data, property calendar sync</w:t>
-      </w:r>
-    </w:p>
-    <w:p>
-      <w:pPr>
-        <w:pStyle w:val="ListParagraph"/>
-        <w:numPr>
-          <w:ilvl w:val="0"/>
-          <w:numId w:val="2"/>
-        </w:numPr>
-      </w:pPr>
-      <w:r>
-        <w:rPr>
-          <w:b/>
-          <w:bCs/>
-        </w:rPr>
-        <w:t xml:space="preserve">Guesty API: </w:t>
-      </w:r>
-      <w:r>
-        <w:t xml:space="preserve">Sync all properties, bookings, guest communications</w:t>
-      </w:r>
-    </w:p>
-    <w:p>
-      <w:pPr>
-        <w:pStyle w:val="ListParagraph"/>
-        <w:numPr>
-          <w:ilvl w:val="0"/>
-          <w:numId w:val="2"/>
-        </w:numPr>
-      </w:pPr>
-      <w:r>
-        <w:rPr>
-          <w:b/>
-          <w:bCs/>
-        </w:rPr>
-        <w:t xml:space="preserve">Hostaway API: </w:t>
-      </w:r>
-      <w:r>
-        <w:t xml:space="preserve">Bi-directional sync, cleaning status updates</w:t>
       </w:r>
     </w:p>
     <w:p>
@@ -3070,11 +3032,6 @@
           </w:p>
           <w:p>
             <w:r>
-              <w:t xml:space="preserve">• Guesty + Hostaway integrations</w:t>
-            </w:r>
-          </w:p>
-          <w:p>
-            <w:r>
               <w:t xml:space="preserve">• Webhook handlers for real-time sync</w:t>
             </w:r>
           </w:p>
@@ -4472,7 +4429,7 @@
         <w:t xml:space="preserve">Apply for API access: </w:t>
       </w:r>
       <w:r>
-        <w:t xml:space="preserve">Airbnb, Vrbo, Booking.com, Guesty, Hostaway developer programs</w:t>
+        <w:t>Airbnb, Vrbo, Booking.com developer programs</w:t>
       </w:r>
     </w:p>
     <w:p>

</xml_diff>